<commit_message>
docs: reconcile generated publication status
</commit_message>
<xml_diff>
--- a/docs/NewsLens_AI_Code_Explanation_and_Developer_Guide.docx
+++ b/docs/NewsLens_AI_Code_Explanation_and_Developer_Guide.docx
@@ -274,7 +274,7 @@
                 <w:rFonts w:ascii="Calibri" w:hAnsi="Calibri"/>
                 <w:sz w:val="16"/>
               </w:rPr>
-              <w:t>GitHub-ready public documentation; publication pending owner action</w:t>
+              <w:t>Public GitHub repository active; Streamlit and Vercel blocked pending a legally redistributable public model</w:t>
             </w:r>
           </w:p>
         </w:tc>
@@ -531,7 +531,7 @@
                 <w:rFonts w:ascii="Calibri" w:hAnsi="Calibri"/>
                 <w:sz w:val="16"/>
               </w:rPr>
-              <w:t>Intended canonical repository: https://github.com/DevenGaikwad/NewsLens-AI (not yet created)</w:t>
+              <w:t>Canonical public repository: https://github.com/DevenGaikwad/NewsLens-AI (active)</w:t>
             </w:r>
           </w:p>
         </w:tc>
@@ -1233,7 +1233,7 @@
         <w:drawing>
           <wp:inline xmlns:a="http://schemas.openxmlformats.org/drawingml/2006/main" xmlns:pic="http://schemas.openxmlformats.org/drawingml/2006/picture">
             <wp:extent cx="5669280" cy="3247565"/>
-            <wp:docPr id="73" name="Picture 73" descr="Figure D.1. Layered source architecture." title="Figure D.1. Layered source architecture."/>
+            <wp:docPr id="89" name="Picture 89" descr="Figure D.1. Layered source architecture." title="Figure D.1. Layered source architecture."/>
             <wp:cNvGraphicFramePr>
               <a:graphicFrameLocks noChangeAspect="1"/>
             </wp:cNvGraphicFramePr>
@@ -1297,7 +1297,7 @@
         <w:drawing>
           <wp:inline xmlns:a="http://schemas.openxmlformats.org/drawingml/2006/main" xmlns:pic="http://schemas.openxmlformats.org/drawingml/2006/picture">
             <wp:extent cx="5669280" cy="3247565"/>
-            <wp:docPr id="74" name="Picture 74" descr="Figure D.2. Component/module dependencies." title="Figure D.2. Component/module dependencies."/>
+            <wp:docPr id="90" name="Picture 90" descr="Figure D.2. Component/module dependencies." title="Figure D.2. Component/module dependencies."/>
             <wp:cNvGraphicFramePr>
               <a:graphicFrameLocks noChangeAspect="1"/>
             </wp:cNvGraphicFramePr>
@@ -2848,7 +2848,7 @@
         <w:drawing>
           <wp:inline xmlns:a="http://schemas.openxmlformats.org/drawingml/2006/main" xmlns:pic="http://schemas.openxmlformats.org/drawingml/2006/picture">
             <wp:extent cx="5669280" cy="3247565"/>
-            <wp:docPr id="75" name="Picture 75" descr="Figure D.3. Offline model training." title="Figure D.3. Offline model training."/>
+            <wp:docPr id="91" name="Picture 91" descr="Figure D.3. Offline model training." title="Figure D.3. Offline model training."/>
             <wp:cNvGraphicFramePr>
               <a:graphicFrameLocks noChangeAspect="1"/>
             </wp:cNvGraphicFramePr>
@@ -2978,7 +2978,7 @@
         <w:drawing>
           <wp:inline xmlns:a="http://schemas.openxmlformats.org/drawingml/2006/main" xmlns:pic="http://schemas.openxmlformats.org/drawingml/2006/picture">
             <wp:extent cx="5669280" cy="3247565"/>
-            <wp:docPr id="76" name="Picture 76" descr="Figure D.4. Runtime inference contracts." title="Figure D.4. Runtime inference contracts."/>
+            <wp:docPr id="92" name="Picture 92" descr="Figure D.4. Runtime inference contracts." title="Figure D.4. Runtime inference contracts."/>
             <wp:cNvGraphicFramePr>
               <a:graphicFrameLocks noChangeAspect="1"/>
             </wp:cNvGraphicFramePr>
@@ -3145,7 +3145,7 @@
         <w:drawing>
           <wp:inline xmlns:a="http://schemas.openxmlformats.org/drawingml/2006/main" xmlns:pic="http://schemas.openxmlformats.org/drawingml/2006/picture">
             <wp:extent cx="5669280" cy="3247565"/>
-            <wp:docPr id="77" name="Picture 77" descr="Figure D.5. Local analyses table." title="Figure D.5. Local analyses table."/>
+            <wp:docPr id="93" name="Picture 93" descr="Figure D.5. Local analyses table." title="Figure D.5. Local analyses table."/>
             <wp:cNvGraphicFramePr>
               <a:graphicFrameLocks noChangeAspect="1"/>
             </wp:cNvGraphicFramePr>
@@ -3296,7 +3296,7 @@
         <w:drawing>
           <wp:inline xmlns:a="http://schemas.openxmlformats.org/drawingml/2006/main" xmlns:pic="http://schemas.openxmlformats.org/drawingml/2006/picture">
             <wp:extent cx="5669280" cy="3247565"/>
-            <wp:docPr id="78" name="Picture 78" descr="Figure D.6. Native same-tab navigation." title="Figure D.6. Native same-tab navigation."/>
+            <wp:docPr id="94" name="Picture 94" descr="Figure D.6. Native same-tab navigation." title="Figure D.6. Native same-tab navigation."/>
             <wp:cNvGraphicFramePr>
               <a:graphicFrameLocks noChangeAspect="1"/>
             </wp:cNvGraphicFramePr>
@@ -3467,7 +3467,7 @@
         <w:drawing>
           <wp:inline xmlns:a="http://schemas.openxmlformats.org/drawingml/2006/main" xmlns:pic="http://schemas.openxmlformats.org/drawingml/2006/picture">
             <wp:extent cx="5669280" cy="3700780"/>
-            <wp:docPr id="79" name="Picture 79" descr="Figure D.7. Explanation and export surface." title="Figure D.7. Explanation and export surface."/>
+            <wp:docPr id="95" name="Picture 95" descr="Figure D.7. Explanation and export surface." title="Figure D.7. Explanation and export surface."/>
             <wp:cNvGraphicFramePr>
               <a:graphicFrameLocks noChangeAspect="1"/>
             </wp:cNvGraphicFramePr>
@@ -3475,7 +3475,7 @@
               <a:graphicData uri="http://schemas.openxmlformats.org/drawingml/2006/picture">
                 <pic:pic>
                   <pic:nvPicPr>
-                    <pic:cNvPr id="0" name="04_explainability_and_downloads.png"/>
+                    <pic:cNvPr id="0" name="image.png"/>
                     <pic:cNvPicPr/>
                   </pic:nvPicPr>
                   <pic:blipFill>
@@ -4514,7 +4514,7 @@
         <w:drawing>
           <wp:inline xmlns:a="http://schemas.openxmlformats.org/drawingml/2006/main" xmlns:pic="http://schemas.openxmlformats.org/drawingml/2006/picture">
             <wp:extent cx="5669280" cy="3247565"/>
-            <wp:docPr id="80" name="Picture 80" descr="Figure D.8. Target public deployment architecture." title="Figure D.8. Target public deployment architecture."/>
+            <wp:docPr id="96" name="Picture 96" descr="Figure D.8. Target public deployment architecture." title="Figure D.8. Target public deployment architecture."/>
             <wp:cNvGraphicFramePr>
               <a:graphicFrameLocks noChangeAspect="1"/>
             </wp:cNvGraphicFramePr>
@@ -4526,7 +4526,7 @@
                     <pic:cNvPicPr/>
                   </pic:nvPicPr>
                   <pic:blipFill>
-                    <a:blip r:embed="rId17"/>
+                    <a:blip r:embed="rId16"/>
                     <a:stretch>
                       <a:fillRect/>
                     </a:stretch>
@@ -4556,12 +4556,12 @@
     </w:p>
     <w:p>
       <w:r>
-        <w:t>Vercel is the intended editorial presentation shell while Streamlit Community Cloud would run the unchanged Python/ML application from app.py. Neither service is claimed live in this staging document.</w:t>
+        <w:t>Vercel is the intended editorial presentation shell while Streamlit Community Cloud would run the unchanged Python/ML application from app.py. Neither Streamlit nor Vercel is currently deployed.</w:t>
       </w:r>
     </w:p>
     <w:p>
       <w:r>
-        <w:t>The public Streamlit UI defaults to temporary per-session SQLite and makes no durable-history promise. https://github.com/DevenGaikwad/NewsLens-AI is the intended canonical repository, but it has not yet been created. Public push and functional hosting remain blocked because the ISOT-derived Joblib and matching calibration redistribution basis is unresolved. The public staging archive excludes both artifacts; no runtime retraining or mock classifier is used.</w:t>
+        <w:t>The intended public Streamlit deployment defaults to temporary per-session SQLite and makes no durable-history promise. https://github.com/DevenGaikwad/NewsLens-AI is the canonical active public repository. Functional hosting remains blocked until a legally redistributable public model and complete rights chain are verified. The public repository excludes the private model and matching calibration; no runtime retraining or mock classifier is used.</w:t>
       </w:r>
     </w:p>
     <w:p>

</xml_diff>

<commit_message>
docs: finalize developer guide publication status
</commit_message>
<xml_diff>
--- a/docs/NewsLens_AI_Code_Explanation_and_Developer_Guide.docx
+++ b/docs/NewsLens_AI_Code_Explanation_and_Developer_Guide.docx
@@ -1233,7 +1233,7 @@
         <w:drawing>
           <wp:inline xmlns:a="http://schemas.openxmlformats.org/drawingml/2006/main" xmlns:pic="http://schemas.openxmlformats.org/drawingml/2006/picture">
             <wp:extent cx="5669280" cy="3247565"/>
-            <wp:docPr id="89" name="Picture 89" descr="Figure D.1. Layered source architecture." title="Figure D.1. Layered source architecture."/>
+            <wp:docPr id="73" name="Picture 73" descr="Figure D.1. Layered source architecture." title="Figure D.1. Layered source architecture."/>
             <wp:cNvGraphicFramePr>
               <a:graphicFrameLocks noChangeAspect="1"/>
             </wp:cNvGraphicFramePr>
@@ -1297,7 +1297,7 @@
         <w:drawing>
           <wp:inline xmlns:a="http://schemas.openxmlformats.org/drawingml/2006/main" xmlns:pic="http://schemas.openxmlformats.org/drawingml/2006/picture">
             <wp:extent cx="5669280" cy="3247565"/>
-            <wp:docPr id="90" name="Picture 90" descr="Figure D.2. Component/module dependencies." title="Figure D.2. Component/module dependencies."/>
+            <wp:docPr id="74" name="Picture 74" descr="Figure D.2. Component/module dependencies." title="Figure D.2. Component/module dependencies."/>
             <wp:cNvGraphicFramePr>
               <a:graphicFrameLocks noChangeAspect="1"/>
             </wp:cNvGraphicFramePr>
@@ -2848,7 +2848,7 @@
         <w:drawing>
           <wp:inline xmlns:a="http://schemas.openxmlformats.org/drawingml/2006/main" xmlns:pic="http://schemas.openxmlformats.org/drawingml/2006/picture">
             <wp:extent cx="5669280" cy="3247565"/>
-            <wp:docPr id="91" name="Picture 91" descr="Figure D.3. Offline model training." title="Figure D.3. Offline model training."/>
+            <wp:docPr id="75" name="Picture 75" descr="Figure D.3. Offline model training." title="Figure D.3. Offline model training."/>
             <wp:cNvGraphicFramePr>
               <a:graphicFrameLocks noChangeAspect="1"/>
             </wp:cNvGraphicFramePr>
@@ -2978,7 +2978,7 @@
         <w:drawing>
           <wp:inline xmlns:a="http://schemas.openxmlformats.org/drawingml/2006/main" xmlns:pic="http://schemas.openxmlformats.org/drawingml/2006/picture">
             <wp:extent cx="5669280" cy="3247565"/>
-            <wp:docPr id="92" name="Picture 92" descr="Figure D.4. Runtime inference contracts." title="Figure D.4. Runtime inference contracts."/>
+            <wp:docPr id="76" name="Picture 76" descr="Figure D.4. Runtime inference contracts." title="Figure D.4. Runtime inference contracts."/>
             <wp:cNvGraphicFramePr>
               <a:graphicFrameLocks noChangeAspect="1"/>
             </wp:cNvGraphicFramePr>
@@ -3145,7 +3145,7 @@
         <w:drawing>
           <wp:inline xmlns:a="http://schemas.openxmlformats.org/drawingml/2006/main" xmlns:pic="http://schemas.openxmlformats.org/drawingml/2006/picture">
             <wp:extent cx="5669280" cy="3247565"/>
-            <wp:docPr id="93" name="Picture 93" descr="Figure D.5. Local analyses table." title="Figure D.5. Local analyses table."/>
+            <wp:docPr id="77" name="Picture 77" descr="Figure D.5. Local analyses table." title="Figure D.5. Local analyses table."/>
             <wp:cNvGraphicFramePr>
               <a:graphicFrameLocks noChangeAspect="1"/>
             </wp:cNvGraphicFramePr>
@@ -3296,7 +3296,7 @@
         <w:drawing>
           <wp:inline xmlns:a="http://schemas.openxmlformats.org/drawingml/2006/main" xmlns:pic="http://schemas.openxmlformats.org/drawingml/2006/picture">
             <wp:extent cx="5669280" cy="3247565"/>
-            <wp:docPr id="94" name="Picture 94" descr="Figure D.6. Native same-tab navigation." title="Figure D.6. Native same-tab navigation."/>
+            <wp:docPr id="78" name="Picture 78" descr="Figure D.6. Native same-tab navigation." title="Figure D.6. Native same-tab navigation."/>
             <wp:cNvGraphicFramePr>
               <a:graphicFrameLocks noChangeAspect="1"/>
             </wp:cNvGraphicFramePr>
@@ -3467,7 +3467,7 @@
         <w:drawing>
           <wp:inline xmlns:a="http://schemas.openxmlformats.org/drawingml/2006/main" xmlns:pic="http://schemas.openxmlformats.org/drawingml/2006/picture">
             <wp:extent cx="5669280" cy="3700780"/>
-            <wp:docPr id="95" name="Picture 95" descr="Figure D.7. Explanation and export surface." title="Figure D.7. Explanation and export surface."/>
+            <wp:docPr id="79" name="Picture 79" descr="Figure D.7. Explanation and export surface." title="Figure D.7. Explanation and export surface."/>
             <wp:cNvGraphicFramePr>
               <a:graphicFrameLocks noChangeAspect="1"/>
             </wp:cNvGraphicFramePr>
@@ -3475,7 +3475,7 @@
               <a:graphicData uri="http://schemas.openxmlformats.org/drawingml/2006/picture">
                 <pic:pic>
                   <pic:nvPicPr>
-                    <pic:cNvPr id="0" name="image.png"/>
+                    <pic:cNvPr id="0" name="04_explainability_and_downloads.png"/>
                     <pic:cNvPicPr/>
                   </pic:nvPicPr>
                   <pic:blipFill>
@@ -4514,7 +4514,7 @@
         <w:drawing>
           <wp:inline xmlns:a="http://schemas.openxmlformats.org/drawingml/2006/main" xmlns:pic="http://schemas.openxmlformats.org/drawingml/2006/picture">
             <wp:extent cx="5669280" cy="3247565"/>
-            <wp:docPr id="96" name="Picture 96" descr="Figure D.8. Target public deployment architecture." title="Figure D.8. Target public deployment architecture."/>
+            <wp:docPr id="80" name="Picture 80" descr="Figure D.8. Target public deployment architecture." title="Figure D.8. Target public deployment architecture."/>
             <wp:cNvGraphicFramePr>
               <a:graphicFrameLocks noChangeAspect="1"/>
             </wp:cNvGraphicFramePr>
@@ -4526,7 +4526,7 @@
                     <pic:cNvPicPr/>
                   </pic:nvPicPr>
                   <pic:blipFill>
-                    <a:blip r:embed="rId16"/>
+                    <a:blip r:embed="rId17"/>
                     <a:stretch>
                       <a:fillRect/>
                     </a:stretch>

</xml_diff>

<commit_message>
docs: make publication reconciliation idempotent (#17)
* docs: reconcile generated publication status

* fix: make document reconciliation byte-idempotent

* docs: finalize setup guide publication status

* docs: finalize developer guide publication status

* docs: finalize concepts guide publication status

* docs: finalize project report publication status
</commit_message>
<xml_diff>
--- a/docs/NewsLens_AI_Code_Explanation_and_Developer_Guide.docx
+++ b/docs/NewsLens_AI_Code_Explanation_and_Developer_Guide.docx
@@ -274,7 +274,7 @@
                 <w:rFonts w:ascii="Calibri" w:hAnsi="Calibri"/>
                 <w:sz w:val="16"/>
               </w:rPr>
-              <w:t>GitHub-ready public documentation; publication pending owner action</w:t>
+              <w:t>Public GitHub repository active; Streamlit and Vercel blocked pending a legally redistributable public model</w:t>
             </w:r>
           </w:p>
         </w:tc>
@@ -531,7 +531,7 @@
                 <w:rFonts w:ascii="Calibri" w:hAnsi="Calibri"/>
                 <w:sz w:val="16"/>
               </w:rPr>
-              <w:t>Intended canonical repository: https://github.com/DevenGaikwad/NewsLens-AI (not yet created)</w:t>
+              <w:t>Canonical public repository: https://github.com/DevenGaikwad/NewsLens-AI (active)</w:t>
             </w:r>
           </w:p>
         </w:tc>
@@ -4556,12 +4556,12 @@
     </w:p>
     <w:p>
       <w:r>
-        <w:t>Vercel is the intended editorial presentation shell while Streamlit Community Cloud would run the unchanged Python/ML application from app.py. Neither service is claimed live in this staging document.</w:t>
+        <w:t>Vercel is the intended editorial presentation shell while Streamlit Community Cloud would run the unchanged Python/ML application from app.py. Neither Streamlit nor Vercel is currently deployed.</w:t>
       </w:r>
     </w:p>
     <w:p>
       <w:r>
-        <w:t>The public Streamlit UI defaults to temporary per-session SQLite and makes no durable-history promise. https://github.com/DevenGaikwad/NewsLens-AI is the intended canonical repository, but it has not yet been created. Public push and functional hosting remain blocked because the ISOT-derived Joblib and matching calibration redistribution basis is unresolved. The public staging archive excludes both artifacts; no runtime retraining or mock classifier is used.</w:t>
+        <w:t>The intended public Streamlit deployment defaults to temporary per-session SQLite and makes no durable-history promise. https://github.com/DevenGaikwad/NewsLens-AI is the canonical active public repository. Functional hosting remains blocked until a legally redistributable public model and complete rights chain are verified. The public repository excludes the private model and matching calibration; no runtime retraining or mock classifier is used.</w:t>
       </w:r>
     </w:p>
     <w:p>

</xml_diff>